<commit_message>
CI: estágio de segurança e o Next.js 16.4.3; DOC-04 com a estrutura real
pip-audit e npm audit (produção, alta ou crítica) entram como estágio
bloqueante, o de segurança do DOC-09. O npm audit acusou o Next.js 16.4.0
(GHSA-2464-fhr4-w9xw, crítica, entre outras), corrigido no 16.4.3; o portal
é exportação estática e não ficava exposto. O DOC-04 descreve as pastas e a
hospedagem que existem (#19).
</commit_message>
<xml_diff>
--- a/docs/DOC-04_Arquitetura.docx
+++ b/docs/DOC-04_Arquitetura.docx
@@ -267,7 +267,7 @@
                 <w:sz w:val="19"/>
                 <w:szCs w:val="19"/>
               </w:rPr>
-              <w:t xml:space="preserve">1.1</w:t>
+              <w:t xml:space="preserve">1.2</w:t>
             </w:r>
           </w:p>
         </w:tc>
@@ -326,7 +326,7 @@
                 <w:sz w:val="19"/>
                 <w:szCs w:val="19"/>
               </w:rPr>
-              <w:t xml:space="preserve">7 de outubro de 2026</w:t>
+              <w:t xml:space="preserve">30 de outubro de 2026</w:t>
             </w:r>
           </w:p>
         </w:tc>
@@ -385,7 +385,7 @@
                 <w:sz w:val="19"/>
                 <w:szCs w:val="19"/>
               </w:rPr>
-              <w:t xml:space="preserve">Documento base; seção 9 com a implantação da Fase 1 (ADR-026)</w:t>
+              <w:t xml:space="preserve">Documento base; seções 5 e 9 com a estrutura e a implantação reais (ADR-026, ADR-050)</w:t>
             </w:r>
           </w:p>
         </w:tc>
@@ -6738,6 +6738,20 @@
       </w:r>
       <w:bookmarkEnd w:id="19"/>
     </w:p>
+    <w:p>
+      <w:pPr>
+        <w:spacing w:after="120"/>
+      </w:pPr>
+      <w:r>
+        <w:rPr>
+          <w:b w:val="false"/>
+          <w:bCs w:val="false"/>
+          <w:i w:val="false"/>
+          <w:iCs w:val="false"/>
+        </w:rPr>
+        <w:t xml:space="preserve">A estrutura real em outubro de 2026. Pastas previstas no desenho inicial e ainda não criadas: a API pública em TypeScript, o enriquecimento separado, os conectores declarativos em YAML (Fase 3), a orquestração em Dagster e o Terraform. O detalhe de cada pacote está na página Componentes da Wiki.</w:t>
+      </w:r>
+    </w:p>
     <w:tbl>
       <w:tblPr>
         <w:tblW w:type="dxa" w:w="9600"/>
@@ -6781,7 +6795,7 @@
                 <w:sz w:val="18"/>
                 <w:szCs w:val="18"/>
               </w:rPr>
-              <w:t xml:space="preserve">lumen/</w:t>
+              <w:t xml:space="preserve">FalkyriaLumen/</w:t>
             </w:r>
           </w:p>
         </w:tc>
@@ -6847,7 +6861,7 @@
                 <w:sz w:val="18"/>
                 <w:szCs w:val="18"/>
               </w:rPr>
-              <w:t xml:space="preserve">│   ├── canonico/              # esquema canonico: unica fonte de verdade do modelo</w:t>
+              <w:t xml:space="preserve">│   ├── canonico/       # esquema canonico, identidade, documentos e a migracao 0001 (PostgreSQL)</w:t>
             </w:r>
           </w:p>
         </w:tc>
@@ -6880,7 +6894,7 @@
                 <w:sz w:val="18"/>
                 <w:szCs w:val="18"/>
               </w:rPr>
-              <w:t xml:space="preserve">│   │   ├── schemas/           # definicoes versionadas (contrato entre Python e TS)</w:t>
+              <w:t xml:space="preserve">│   ├── ingestao/       # Python - coleta HTTP, bronze com hash (local ou S3) e adaptadores</w:t>
             </w:r>
           </w:p>
         </w:tc>
@@ -6913,7 +6927,7 @@
                 <w:sz w:val="18"/>
                 <w:szCs w:val="18"/>
               </w:rPr>
-              <w:t xml:space="preserve">│   │   └── migrations/</w:t>
+              <w:t xml:space="preserve">│   ├── normalizacao/   # Python - bruto para canonico, qualidade e quarentena</w:t>
             </w:r>
           </w:p>
         </w:tc>
@@ -6946,7 +6960,7 @@
                 <w:sz w:val="18"/>
                 <w:szCs w:val="18"/>
               </w:rPr>
-              <w:t xml:space="preserve">│   ├── ingestao/              # Python - portas e adaptadores de coleta</w:t>
+              <w:t xml:space="preserve">│   ├── conformidade/   # Python - entregas da LRF ao Tesouro (SICONFI)</w:t>
             </w:r>
           </w:p>
         </w:tc>
@@ -6979,7 +6993,7 @@
                 <w:sz w:val="18"/>
                 <w:szCs w:val="18"/>
               </w:rPr>
-              <w:t xml:space="preserve">│   │   ├── portas/            # protocolo FonteDados e tipos de dominio</w:t>
+              <w:t xml:space="preserve">│   ├── deteccao/       # Python - regras em modo silencioso (A-01, A-05, J-01)</w:t>
             </w:r>
           </w:p>
         </w:tc>
@@ -7012,7 +7026,7 @@
                 <w:sz w:val="18"/>
                 <w:szCs w:val="18"/>
               </w:rPr>
-              <w:t xml:space="preserve">│   │   ├── adaptadores/</w:t>
+              <w:t xml:space="preserve">│   ├── painel/         # Python - paineis de contratacoes, conformidade, governos municipais,</w:t>
             </w:r>
           </w:p>
         </w:tc>
@@ -7045,7 +7059,7 @@
                 <w:sz w:val="18"/>
                 <w:szCs w:val="18"/>
               </w:rPr>
-              <w:t xml:space="preserve">│   │   │   ├── api/           # pncp.py, siconfi.py, cgu.py, rfb.py, tse.py</w:t>
+              <w:t xml:space="preserve">│   │                   #   empresas, tribunais de contas e avisos (site estatico de dados)</w:t>
             </w:r>
           </w:p>
         </w:tc>
@@ -7078,7 +7092,7 @@
                 <w:sz w:val="18"/>
                 <w:szCs w:val="18"/>
               </w:rPr>
-              <w:t xml:space="preserve">│   │   │   ├── plataforma/    # familias de portal municipal</w:t>
+              <w:t xml:space="preserve">│   ├── economia/       # Python - series de economia e contas publicas</w:t>
             </w:r>
           </w:p>
         </w:tc>
@@ -7111,7 +7125,7 @@
                 <w:sz w:val="18"/>
                 <w:szCs w:val="18"/>
               </w:rPr>
-              <w:t xml:space="preserve">│   │   │   ├── declarativo/   # motor que interpreta as specs YAML</w:t>
+              <w:t xml:space="preserve">│   ├── mercado/        # Python - precos de referencia (ANP) para a A-05</w:t>
             </w:r>
           </w:p>
         </w:tc>
@@ -7144,7 +7158,7 @@
                 <w:sz w:val="18"/>
                 <w:szCs w:val="18"/>
               </w:rPr>
-              <w:t xml:space="preserve">│   │   │   └── documento/     # extracao de PDF, XLSX, HTML, OCR</w:t>
+              <w:t xml:space="preserve">│   ├── eleicoes/       # Python - aba Eleicoes: TSE ao vivo e dados abertos desde 1933</w:t>
             </w:r>
           </w:p>
         </w:tc>
@@ -7177,7 +7191,7 @@
                 <w:sz w:val="18"/>
                 <w:szCs w:val="18"/>
               </w:rPr>
-              <w:t xml:space="preserve">│   │   └── fontes/            # specs YAML, uma por fonte cadastrada</w:t>
+              <w:t xml:space="preserve">│   ├── orquestracao/   # Python - comando lumen e o pipeline local</w:t>
             </w:r>
           </w:p>
         </w:tc>
@@ -7210,7 +7224,7 @@
                 <w:sz w:val="18"/>
                 <w:szCs w:val="18"/>
               </w:rPr>
-              <w:t xml:space="preserve">│   ├── normalizacao/          # Python - bruto para canonico + qualidade</w:t>
+              <w:t xml:space="preserve">│   └── portal/         # Next.js - interface publica, exportacao estatica</w:t>
             </w:r>
           </w:p>
         </w:tc>
@@ -7243,7 +7257,7 @@
                 <w:sz w:val="18"/>
                 <w:szCs w:val="18"/>
               </w:rPr>
-              <w:t xml:space="preserve">│   ├── enriquecimento/        # Python - societario, catalogo, grupo de pares</w:t>
+              <w:t xml:space="preserve">├── infra/</w:t>
             </w:r>
           </w:p>
         </w:tc>
@@ -7276,7 +7290,7 @@
                 <w:sz w:val="18"/>
                 <w:szCs w:val="18"/>
               </w:rPr>
-              <w:t xml:space="preserve">│   ├── deteccao/              # Python - motor e catalogo de regras</w:t>
+              <w:t xml:space="preserve">│   ├── docker-compose.yml   # PostgreSQL e MinIO locais</w:t>
             </w:r>
           </w:p>
         </w:tc>
@@ -7309,7 +7323,7 @@
                 <w:sz w:val="18"/>
                 <w:szCs w:val="18"/>
               </w:rPr>
-              <w:t xml:space="preserve">│   │   ├── motor/</w:t>
+              <w:t xml:space="preserve">│   ├── proxy-br/            # intermediario em Sao Paulo (Vercel, ADR-050)</w:t>
             </w:r>
           </w:p>
         </w:tc>
@@ -7342,7 +7356,7 @@
                 <w:sz w:val="18"/>
                 <w:szCs w:val="18"/>
               </w:rPr>
-              <w:t xml:space="preserve">│   │   ├── regras/            # uma regra por arquivo, versionada</w:t>
+              <w:t xml:space="preserve">│   └── runner-br/           # runner proprio no Brasil para o TCE-RS (ADR-050)</w:t>
             </w:r>
           </w:p>
         </w:tc>
@@ -7375,7 +7389,7 @@
                 <w:sz w:val="18"/>
                 <w:szCs w:val="18"/>
               </w:rPr>
-              <w:t xml:space="preserve">│   │   └── calibracao/        # simulacao sobre janela historica</w:t>
+              <w:t xml:space="preserve">├── ferramentas/</w:t>
             </w:r>
           </w:p>
         </w:tc>
@@ -7408,7 +7422,7 @@
                 <w:sz w:val="18"/>
                 <w:szCs w:val="18"/>
               </w:rPr>
-              <w:t xml:space="preserve">│   ├── conformidade/          # Python - indice de transparencia</w:t>
+              <w:t xml:space="preserve">│   ├── lint-vocabulario/    # verificador de vocabulario controlado (ADR-007)</w:t>
             </w:r>
           </w:p>
         </w:tc>
@@ -7441,7 +7455,7 @@
                 <w:sz w:val="18"/>
                 <w:szCs w:val="18"/>
               </w:rPr>
-              <w:t xml:space="preserve">│   ├── api/                   # TypeScript - API publica (arquitetura limpa)</w:t>
+              <w:t xml:space="preserve">│   └── referencia/          # extracao do codigo para o DOC-11</w:t>
             </w:r>
           </w:p>
         </w:tc>
@@ -7474,7 +7488,7 @@
                 <w:sz w:val="18"/>
                 <w:szCs w:val="18"/>
               </w:rPr>
-              <w:t xml:space="preserve">│   │   ├── dominio/</w:t>
+              <w:t xml:space="preserve">├── .github/workflows/  # CI e as coletas agendadas (o orquestrador da Fase 1, ADR-026)</w:t>
             </w:r>
           </w:p>
         </w:tc>
@@ -7507,7 +7521,7 @@
                 <w:sz w:val="18"/>
                 <w:szCs w:val="18"/>
               </w:rPr>
-              <w:t xml:space="preserve">│   │   ├── aplicacao/</w:t>
+              <w:t xml:space="preserve">├── docs/               # DOC-01 a DOC-13, ADRs e a Wiki</w:t>
             </w:r>
           </w:p>
         </w:tc>
@@ -7540,7 +7554,7 @@
                 <w:sz w:val="18"/>
                 <w:szCs w:val="18"/>
               </w:rPr>
-              <w:t xml:space="preserve">│   │   ├── infra/</w:t>
+              <w:t xml:space="preserve">├── docs-src/           # fonte dos .docx</w:t>
             </w:r>
           </w:p>
         </w:tc>
@@ -7573,7 +7587,7 @@
                 <w:sz w:val="18"/>
                 <w:szCs w:val="18"/>
               </w:rPr>
-              <w:t xml:space="preserve">│   │   └── http/</w:t>
+              <w:t xml:space="preserve">└── testes/</w:t>
             </w:r>
           </w:p>
         </w:tc>
@@ -7606,7 +7620,7 @@
                 <w:sz w:val="18"/>
                 <w:szCs w:val="18"/>
               </w:rPr>
-              <w:t xml:space="preserve">│   └── portal/                # Next.js - interface publica</w:t>
+              <w:t xml:space="preserve">    ├── fixtures/       # amostras reais de cada fonte, versionadas</w:t>
             </w:r>
           </w:p>
         </w:tc>
@@ -7639,7 +7653,7 @@
                 <w:sz w:val="18"/>
                 <w:szCs w:val="18"/>
               </w:rPr>
-              <w:t xml:space="preserve">├── orquestracao/              # definicoes Dagster: ativos, jobs, agendas</w:t>
+              <w:t xml:space="preserve">    ├── contrato/       # testes de contrato contra as fontes reais</w:t>
             </w:r>
           </w:p>
         </w:tc>
@@ -7672,238 +7686,7 @@
                 <w:sz w:val="18"/>
                 <w:szCs w:val="18"/>
               </w:rPr>
-              <w:t xml:space="preserve">├── infra/                     # Terraform e Docker Compose</w:t>
-            </w:r>
-          </w:p>
-        </w:tc>
-      </w:tr>
-      <w:tr>
-        <w:tc>
-          <w:tcPr>
-            <w:tcW w:type="dxa" w:w="9600"/>
-            <w:tcBorders>
-              <w:top w:val="none" w:color="FFFFFF" w:sz="0"/>
-              <w:left w:val="none" w:color="FFFFFF" w:sz="0"/>
-              <w:bottom w:val="none" w:color="FFFFFF" w:sz="0"/>
-              <w:right w:val="none" w:color="FFFFFF" w:sz="0"/>
-            </w:tcBorders>
-            <w:shd w:fill="F5F5F5" w:val="clear"/>
-            <w:tcMar>
-              <w:top w:type="dxa" w:w="20"/>
-              <w:left w:type="dxa" w:w="120"/>
-              <w:bottom w:type="dxa" w:w="20"/>
-              <w:right w:type="dxa" w:w="100"/>
-            </w:tcMar>
-          </w:tcPr>
-          <w:p>
-            <w:pPr>
-              <w:spacing w:after="0"/>
-            </w:pPr>
-            <w:r>
-              <w:rPr>
-                <w:rFonts w:ascii="Consolas" w:cs="Consolas" w:eastAsia="Consolas" w:hAnsi="Consolas"/>
-                <w:sz w:val="18"/>
-                <w:szCs w:val="18"/>
-              </w:rPr>
-              <w:t xml:space="preserve">├── ferramentas/</w:t>
-            </w:r>
-          </w:p>
-        </w:tc>
-      </w:tr>
-      <w:tr>
-        <w:tc>
-          <w:tcPr>
-            <w:tcW w:type="dxa" w:w="9600"/>
-            <w:tcBorders>
-              <w:top w:val="none" w:color="FFFFFF" w:sz="0"/>
-              <w:left w:val="none" w:color="FFFFFF" w:sz="0"/>
-              <w:bottom w:val="none" w:color="FFFFFF" w:sz="0"/>
-              <w:right w:val="none" w:color="FFFFFF" w:sz="0"/>
-            </w:tcBorders>
-            <w:shd w:fill="F5F5F5" w:val="clear"/>
-            <w:tcMar>
-              <w:top w:type="dxa" w:w="20"/>
-              <w:left w:type="dxa" w:w="120"/>
-              <w:bottom w:type="dxa" w:w="20"/>
-              <w:right w:type="dxa" w:w="100"/>
-            </w:tcMar>
-          </w:tcPr>
-          <w:p>
-            <w:pPr>
-              <w:spacing w:after="0"/>
-            </w:pPr>
-            <w:r>
-              <w:rPr>
-                <w:rFonts w:ascii="Consolas" w:cs="Consolas" w:eastAsia="Consolas" w:hAnsi="Consolas"/>
-                <w:sz w:val="18"/>
-                <w:szCs w:val="18"/>
-              </w:rPr>
-              <w:t xml:space="preserve">│   └── lint-vocabulario/      # verificador de vocabulario controlado (ADR-007)</w:t>
-            </w:r>
-          </w:p>
-        </w:tc>
-      </w:tr>
-      <w:tr>
-        <w:tc>
-          <w:tcPr>
-            <w:tcW w:type="dxa" w:w="9600"/>
-            <w:tcBorders>
-              <w:top w:val="none" w:color="FFFFFF" w:sz="0"/>
-              <w:left w:val="none" w:color="FFFFFF" w:sz="0"/>
-              <w:bottom w:val="none" w:color="FFFFFF" w:sz="0"/>
-              <w:right w:val="none" w:color="FFFFFF" w:sz="0"/>
-            </w:tcBorders>
-            <w:shd w:fill="F5F5F5" w:val="clear"/>
-            <w:tcMar>
-              <w:top w:type="dxa" w:w="20"/>
-              <w:left w:type="dxa" w:w="120"/>
-              <w:bottom w:type="dxa" w:w="20"/>
-              <w:right w:type="dxa" w:w="100"/>
-            </w:tcMar>
-          </w:tcPr>
-          <w:p>
-            <w:pPr>
-              <w:spacing w:after="0"/>
-            </w:pPr>
-            <w:r>
-              <w:rPr>
-                <w:rFonts w:ascii="Consolas" w:cs="Consolas" w:eastAsia="Consolas" w:hAnsi="Consolas"/>
-                <w:sz w:val="18"/>
-                <w:szCs w:val="18"/>
-              </w:rPr>
-              <w:t xml:space="preserve">├── docs/                      # DOC-01 a DOC-10 e ADRs</w:t>
-            </w:r>
-          </w:p>
-        </w:tc>
-      </w:tr>
-      <w:tr>
-        <w:tc>
-          <w:tcPr>
-            <w:tcW w:type="dxa" w:w="9600"/>
-            <w:tcBorders>
-              <w:top w:val="none" w:color="FFFFFF" w:sz="0"/>
-              <w:left w:val="none" w:color="FFFFFF" w:sz="0"/>
-              <w:bottom w:val="none" w:color="FFFFFF" w:sz="0"/>
-              <w:right w:val="none" w:color="FFFFFF" w:sz="0"/>
-            </w:tcBorders>
-            <w:shd w:fill="F5F5F5" w:val="clear"/>
-            <w:tcMar>
-              <w:top w:type="dxa" w:w="20"/>
-              <w:left w:type="dxa" w:w="120"/>
-              <w:bottom w:type="dxa" w:w="20"/>
-              <w:right w:type="dxa" w:w="100"/>
-            </w:tcMar>
-          </w:tcPr>
-          <w:p>
-            <w:pPr>
-              <w:spacing w:after="0"/>
-            </w:pPr>
-            <w:r>
-              <w:rPr>
-                <w:rFonts w:ascii="Consolas" w:cs="Consolas" w:eastAsia="Consolas" w:hAnsi="Consolas"/>
-                <w:sz w:val="18"/>
-                <w:szCs w:val="18"/>
-              </w:rPr>
-              <w:t xml:space="preserve">└── testes/</w:t>
-            </w:r>
-          </w:p>
-        </w:tc>
-      </w:tr>
-      <w:tr>
-        <w:tc>
-          <w:tcPr>
-            <w:tcW w:type="dxa" w:w="9600"/>
-            <w:tcBorders>
-              <w:top w:val="none" w:color="FFFFFF" w:sz="0"/>
-              <w:left w:val="none" w:color="FFFFFF" w:sz="0"/>
-              <w:bottom w:val="none" w:color="FFFFFF" w:sz="0"/>
-              <w:right w:val="none" w:color="FFFFFF" w:sz="0"/>
-            </w:tcBorders>
-            <w:shd w:fill="F5F5F5" w:val="clear"/>
-            <w:tcMar>
-              <w:top w:type="dxa" w:w="20"/>
-              <w:left w:type="dxa" w:w="120"/>
-              <w:bottom w:type="dxa" w:w="20"/>
-              <w:right w:type="dxa" w:w="100"/>
-            </w:tcMar>
-          </w:tcPr>
-          <w:p>
-            <w:pPr>
-              <w:spacing w:after="0"/>
-            </w:pPr>
-            <w:r>
-              <w:rPr>
-                <w:rFonts w:ascii="Consolas" w:cs="Consolas" w:eastAsia="Consolas" w:hAnsi="Consolas"/>
-                <w:sz w:val="18"/>
-                <w:szCs w:val="18"/>
-              </w:rPr>
-              <w:t xml:space="preserve">    ├── fixtures/              # amostras reais de cada fonte, versionadas</w:t>
-            </w:r>
-          </w:p>
-        </w:tc>
-      </w:tr>
-      <w:tr>
-        <w:tc>
-          <w:tcPr>
-            <w:tcW w:type="dxa" w:w="9600"/>
-            <w:tcBorders>
-              <w:top w:val="none" w:color="FFFFFF" w:sz="0"/>
-              <w:left w:val="none" w:color="FFFFFF" w:sz="0"/>
-              <w:bottom w:val="none" w:color="FFFFFF" w:sz="0"/>
-              <w:right w:val="none" w:color="FFFFFF" w:sz="0"/>
-            </w:tcBorders>
-            <w:shd w:fill="F5F5F5" w:val="clear"/>
-            <w:tcMar>
-              <w:top w:type="dxa" w:w="20"/>
-              <w:left w:type="dxa" w:w="120"/>
-              <w:bottom w:type="dxa" w:w="20"/>
-              <w:right w:type="dxa" w:w="100"/>
-            </w:tcMar>
-          </w:tcPr>
-          <w:p>
-            <w:pPr>
-              <w:spacing w:after="0"/>
-            </w:pPr>
-            <w:r>
-              <w:rPr>
-                <w:rFonts w:ascii="Consolas" w:cs="Consolas" w:eastAsia="Consolas" w:hAnsi="Consolas"/>
-                <w:sz w:val="18"/>
-                <w:szCs w:val="18"/>
-              </w:rPr>
-              <w:t xml:space="preserve">    ├── contrato/              # testes de contrato por fonte externa</w:t>
-            </w:r>
-          </w:p>
-        </w:tc>
-      </w:tr>
-      <w:tr>
-        <w:tc>
-          <w:tcPr>
-            <w:tcW w:type="dxa" w:w="9600"/>
-            <w:tcBorders>
-              <w:top w:val="none" w:color="FFFFFF" w:sz="0"/>
-              <w:left w:val="none" w:color="FFFFFF" w:sz="0"/>
-              <w:bottom w:val="none" w:color="FFFFFF" w:sz="0"/>
-              <w:right w:val="none" w:color="FFFFFF" w:sz="0"/>
-            </w:tcBorders>
-            <w:shd w:fill="F5F5F5" w:val="clear"/>
-            <w:tcMar>
-              <w:top w:type="dxa" w:w="20"/>
-              <w:left w:type="dxa" w:w="120"/>
-              <w:bottom w:type="dxa" w:w="20"/>
-              <w:right w:type="dxa" w:w="100"/>
-            </w:tcMar>
-          </w:tcPr>
-          <w:p>
-            <w:pPr>
-              <w:spacing w:after="0"/>
-            </w:pPr>
-            <w:r>
-              <w:rPr>
-                <w:rFonts w:ascii="Consolas" w:cs="Consolas" w:eastAsia="Consolas" w:hAnsi="Consolas"/>
-                <w:sz w:val="18"/>
-                <w:szCs w:val="18"/>
-              </w:rPr>
-              <w:t xml:space="preserve">    └── regras/                # casos sinteticos por regra de deteccao</w:t>
+              <w:t xml:space="preserve">    └── integracao/     # testes contra o PostgreSQL</w:t>
             </w:r>
           </w:p>
         </w:tc>
@@ -9884,7 +9667,7 @@
                 <w:sz w:val="17"/>
                 <w:szCs w:val="17"/>
               </w:rPr>
-              <w:t xml:space="preserve">Cloudflare R2: feeds públicos, estado das cargas e, quando a coleta sair do computador local, a prova com trava de bucket</w:t>
+              <w:t xml:space="preserve">Supabase Storage (compatível com S3) para os feeds das eleições desde 14/10/2026; versões do GitHub (painel-estado) para o estado das coletas; R2 continua como alternativa sem mudar o código</w:t>
             </w:r>
           </w:p>
         </w:tc>
@@ -9911,7 +9694,7 @@
                 <w:sz w:val="17"/>
                 <w:szCs w:val="17"/>
               </w:rPr>
-              <w:t xml:space="preserve">10 GB-mês somados</w:t>
+              <w:t xml:space="preserve">1 GB do Supabase gratuito (o bucket tem teto de 900 MB)</w:t>
             </w:r>
           </w:p>
         </w:tc>
@@ -9970,7 +9753,7 @@
                 <w:sz w:val="17"/>
                 <w:szCs w:val="17"/>
               </w:rPr>
-              <w:t xml:space="preserve">Parquet no R2, consultado com DuckDB</w:t>
+              <w:t xml:space="preserve">Parquet consultado com DuckDB, no estado das coletas</w:t>
             </w:r>
           </w:p>
         </w:tc>
@@ -9997,7 +9780,7 @@
                 <w:sz w:val="17"/>
                 <w:szCs w:val="17"/>
               </w:rPr>
-              <w:t xml:space="preserve">Os mesmos 10 GB</w:t>
+              <w:t xml:space="preserve">O mesmo armazenamento</w:t>
             </w:r>
           </w:p>
         </w:tc>
@@ -10056,7 +9839,7 @@
                 <w:sz w:val="17"/>
                 <w:szCs w:val="17"/>
               </w:rPr>
-              <w:t xml:space="preserve">Supabase gratuito, em organização própria do projeto, com a migração 0001</w:t>
+              <w:t xml:space="preserve">PostgreSQL local (Docker) com a migração 0001; o Supabase do núcleo, em organização própria, ainda por criar</w:t>
             </w:r>
           </w:p>
         </w:tc>
@@ -10169,7 +9952,7 @@
                 <w:sz w:val="17"/>
                 <w:szCs w:val="17"/>
               </w:rPr>
-              <w:t xml:space="preserve">2.000 minutos por mês em repositório privado</w:t>
+              <w:t xml:space="preserve">Repositório público: os minutos não são cobrados</w:t>
             </w:r>
           </w:p>
         </w:tc>
@@ -10228,7 +10011,7 @@
                 <w:sz w:val="17"/>
                 <w:szCs w:val="17"/>
               </w:rPr>
-              <w:t xml:space="preserve">Cloudflare Pages, site estático</w:t>
+              <w:t xml:space="preserve">Vercel, exportação estática; os dados dos painéis no GitHub Pages; o Cloudflare Pages tem fluxo pronto (portal-pages)</w:t>
             </w:r>
           </w:p>
         </w:tc>
@@ -10287,7 +10070,7 @@
                 <w:sz w:val="17"/>
                 <w:szCs w:val="17"/>
               </w:rPr>
-              <w:t xml:space="preserve">Índice de busca e API pública</w:t>
+              <w:t xml:space="preserve">Acesso às fontes só do Brasil</w:t>
             </w:r>
           </w:p>
         </w:tc>
@@ -10314,7 +10097,7 @@
                 <w:sz w:val="17"/>
                 <w:szCs w:val="17"/>
               </w:rPr>
-              <w:t xml:space="preserve">Ainda não implantados: entram nas fases seguintes (DOC-10)</w:t>
+              <w:t xml:space="preserve">Função da Vercel em São Paulo (infra/proxy-br) e, para o TCE-RS, runner próprio num servidor no Brasil (infra/runner-br)</w:t>
             </w:r>
           </w:p>
         </w:tc>
@@ -10322,6 +10105,92 @@
           <w:tcPr>
             <w:tcW w:type="dxa" w:w="3000"/>
             <w:shd w:fill="F2F2F2" w:val="clear"/>
+            <w:tcMar>
+              <w:top w:type="dxa" w:w="70"/>
+              <w:left w:type="dxa" w:w="110"/>
+              <w:bottom w:type="dxa" w:w="70"/>
+              <w:right w:type="dxa" w:w="110"/>
+            </w:tcMar>
+            <w:vAlign w:val="center"/>
+          </w:tcPr>
+          <w:p>
+            <w:pPr>
+              <w:spacing w:after="0"/>
+            </w:pPr>
+            <w:r>
+              <w:rPr>
+                <w:b w:val="false"/>
+                <w:bCs w:val="false"/>
+                <w:sz w:val="17"/>
+                <w:szCs w:val="17"/>
+              </w:rPr>
+              <w:t xml:space="preserve">O servidor do runner, se não for o gratuito</w:t>
+            </w:r>
+          </w:p>
+        </w:tc>
+      </w:tr>
+      <w:tr>
+        <w:trPr>
+          <w:cantSplit/>
+        </w:trPr>
+        <w:tc>
+          <w:tcPr>
+            <w:tcW w:type="dxa" w:w="2400"/>
+            <w:shd w:fill="FFFFFF" w:val="clear"/>
+            <w:tcMar>
+              <w:top w:type="dxa" w:w="70"/>
+              <w:left w:type="dxa" w:w="110"/>
+              <w:bottom w:type="dxa" w:w="70"/>
+              <w:right w:type="dxa" w:w="110"/>
+            </w:tcMar>
+            <w:vAlign w:val="center"/>
+          </w:tcPr>
+          <w:p>
+            <w:pPr>
+              <w:spacing w:after="0"/>
+            </w:pPr>
+            <w:r>
+              <w:rPr>
+                <w:b w:val="false"/>
+                <w:bCs w:val="false"/>
+                <w:sz w:val="17"/>
+                <w:szCs w:val="17"/>
+              </w:rPr>
+              <w:t xml:space="preserve">Índice de busca e API pública</w:t>
+            </w:r>
+          </w:p>
+        </w:tc>
+        <w:tc>
+          <w:tcPr>
+            <w:tcW w:type="dxa" w:w="4200"/>
+            <w:shd w:fill="FFFFFF" w:val="clear"/>
+            <w:tcMar>
+              <w:top w:type="dxa" w:w="70"/>
+              <w:left w:type="dxa" w:w="110"/>
+              <w:bottom w:type="dxa" w:w="70"/>
+              <w:right w:type="dxa" w:w="110"/>
+            </w:tcMar>
+            <w:vAlign w:val="center"/>
+          </w:tcPr>
+          <w:p>
+            <w:pPr>
+              <w:spacing w:after="0"/>
+            </w:pPr>
+            <w:r>
+              <w:rPr>
+                <w:b w:val="false"/>
+                <w:bCs w:val="false"/>
+                <w:sz w:val="17"/>
+                <w:szCs w:val="17"/>
+              </w:rPr>
+              <w:t xml:space="preserve">Ainda não implantados: entram nas fases seguintes (DOC-10)</w:t>
+            </w:r>
+          </w:p>
+        </w:tc>
+        <w:tc>
+          <w:tcPr>
+            <w:tcW w:type="dxa" w:w="3000"/>
+            <w:shd w:fill="FFFFFF" w:val="clear"/>
             <w:tcMar>
               <w:top w:type="dxa" w:w="70"/>
               <w:left w:type="dxa" w:w="110"/>

</xml_diff>